<commit_message>
Nop bao cao chuong 3
</commit_message>
<xml_diff>
--- a/baocao.docx
+++ b/baocao.docx
@@ -1355,6 +1355,14 @@
     </w:p>
     <w:sdt>
       <w:sdtPr>
+        <w:rPr>
+          <w:rFonts w:ascii="Times New Roman" w:eastAsiaTheme="minorHAnsi" w:hAnsi="Times New Roman" w:cstheme="minorBidi"/>
+          <w:b/>
+          <w:color w:val="000000" w:themeColor="text1"/>
+          <w:sz w:val="28"/>
+          <w:szCs w:val="22"/>
+          <w:lang w:val="en-US" w:eastAsia="en-US"/>
+        </w:rPr>
         <w:id w:val="1048882449"/>
         <w:docPartObj>
           <w:docPartGallery w:val="Table of Contents"/>
@@ -1363,12 +1371,7 @@
       </w:sdtPr>
       <w:sdtEndPr>
         <w:rPr>
-          <w:rFonts w:ascii="Times New Roman" w:eastAsiaTheme="minorHAnsi" w:hAnsi="Times New Roman" w:cstheme="minorBidi"/>
-          <w:bCs/>
-          <w:color w:val="000000" w:themeColor="text1"/>
-          <w:sz w:val="28"/>
-          <w:szCs w:val="22"/>
-          <w:lang w:val="en-US" w:eastAsia="en-US"/>
+          <w:bCs/>
         </w:rPr>
       </w:sdtEndPr>
       <w:sdtContent>
@@ -7973,12 +7976,14 @@
         <w:rPr>
           <w:b/>
           <w:bCs/>
+          <w:lang w:val="vi-VN"/>
         </w:rPr>
       </w:pPr>
       <w:r>
         <w:rPr>
           <w:b/>
           <w:bCs/>
+          <w:lang w:val="vi-VN"/>
         </w:rPr>
         <w:lastRenderedPageBreak/>
         <w:t>TÓM TẮT</w:t>
@@ -7986,6 +7991,9 @@
     </w:p>
     <w:p>
       <w:pPr>
+        <w:rPr>
+          <w:lang w:val="vi-VN"/>
+        </w:rPr>
         <w:sectPr>
           <w:pgSz w:w="11907" w:h="16840" w:code="9"/>
           <w:pgMar w:top="1134" w:right="1134" w:bottom="1134" w:left="1985" w:header="680" w:footer="680" w:gutter="0"/>
@@ -25368,18 +25376,7 @@
                 <w:szCs w:val="24"/>
                 <w:lang w:val="vi-VN" w:eastAsia="vi-VN"/>
               </w:rPr>
-              <w:t xml:space="preserve">Quản trị </w:t>
-            </w:r>
-            <w:r>
-              <w:rPr>
-                <w:rFonts w:eastAsia="Times New Roman" w:cs="Times New Roman"/>
-                <w:b w:val="0"/>
-                <w:color w:val="auto"/>
-                <w:sz w:val="24"/>
-                <w:szCs w:val="24"/>
-                <w:lang w:val="vi-VN" w:eastAsia="vi-VN"/>
-              </w:rPr>
-              <w:t>viên</w:t>
+              <w:t>Quản trị viên</w:t>
             </w:r>
           </w:p>
           <w:p>
@@ -29573,7 +29570,6 @@
           <w:bCs/>
           <w:sz w:val="26"/>
           <w:szCs w:val="26"/>
-          <w:lang w:val="vi-VN"/>
         </w:rPr>
       </w:pPr>
       <w:r>
@@ -29651,7 +29647,7 @@
         <w:ind w:firstLine="720"/>
         <w:jc w:val="both"/>
         <w:rPr>
-          <w:b w:val="0"/>
+          <w:bCs/>
           <w:sz w:val="26"/>
           <w:szCs w:val="26"/>
           <w:lang w:val="vi-VN"/>
@@ -44866,16 +44862,7 @@
           <w:szCs w:val="26"/>
           <w:lang w:val="vi-VN"/>
         </w:rPr>
-        <w:t xml:space="preserve">Luồng Khách </w:t>
-      </w:r>
-      <w:r>
-        <w:rPr>
-          <w:b w:val="0"/>
-          <w:sz w:val="26"/>
-          <w:szCs w:val="26"/>
-          <w:lang w:val="vi-VN"/>
-        </w:rPr>
-        <w:t>hàng</w:t>
+        <w:t>Luồng Khách hàng</w:t>
       </w:r>
       <w:r>
         <w:rPr>
@@ -44956,16 +44943,7 @@
           <w:szCs w:val="26"/>
           <w:lang w:val="vi-VN"/>
         </w:rPr>
-        <w:t xml:space="preserve">Luồng Quản trị </w:t>
-      </w:r>
-      <w:r>
-        <w:rPr>
-          <w:b w:val="0"/>
-          <w:sz w:val="26"/>
-          <w:szCs w:val="26"/>
-          <w:lang w:val="vi-VN"/>
-        </w:rPr>
-        <w:t>viên</w:t>
+        <w:t>Luồng Quản trị viên</w:t>
       </w:r>
       <w:r>
         <w:rPr>
@@ -45047,16 +45025,7 @@
           <w:szCs w:val="26"/>
           <w:lang w:val="vi-VN"/>
         </w:rPr>
-        <w:t xml:space="preserve">- </w:t>
-      </w:r>
-      <w:r>
-        <w:rPr>
-          <w:b w:val="0"/>
-          <w:sz w:val="26"/>
-          <w:szCs w:val="26"/>
-          <w:lang w:val="vi-VN"/>
-        </w:rPr>
-        <w:t>Yêu cầu báo cáo thống kê: Luồng dữ liệu này thể hiện các yêu cầu của quản trị viên về việc tổng hợp và tra cứu số liệu phục vụ công tác quản lý hoạt động kinh doanh. Nội dung bao gồm yêu cầu thống kê doanh thu theo thời gian, số lượng đơn hàng, tình hình tiêu thụ sản phẩm, số lượng hàng tồn kho và tình trạng xử lý đơn hàng.</w:t>
+        <w:t>- Yêu cầu báo cáo thống kê: Luồng dữ liệu này thể hiện các yêu cầu của quản trị viên về việc tổng hợp và tra cứu số liệu phục vụ công tác quản lý hoạt động kinh doanh. Nội dung bao gồm yêu cầu thống kê doanh thu theo thời gian, số lượng đơn hàng, tình hình tiêu thụ sản phẩm, số lượng hàng tồn kho và tình trạng xử lý đơn hàng.</w:t>
       </w:r>
     </w:p>
     <w:p>
@@ -45755,17 +45724,7 @@
           <w:szCs w:val="26"/>
           <w:lang w:val="vi-VN"/>
         </w:rPr>
-        <w:t xml:space="preserve"> </w:t>
-      </w:r>
-      <w:r>
-        <w:rPr>
-          <w:b w:val="0"/>
-          <w:bCs/>
-          <w:sz w:val="26"/>
-          <w:szCs w:val="26"/>
-          <w:lang w:val="vi-VN"/>
-        </w:rPr>
-        <w:t xml:space="preserve">Phân hệ Quản lý tài khoản đóng vai trò kiểm soát an toàn hệ thống, xác thực danh tính người dùng và phân định quyền hạn thao tác trên toàn bộ ứng dụng </w:t>
+        <w:t xml:space="preserve"> Phân hệ Quản lý tài khoản đóng vai trò kiểm soát an toàn hệ thống, xác thực danh tính người dùng và phân định quyền hạn thao tác trên toàn bộ ứng dụng </w:t>
       </w:r>
       <w:proofErr w:type="spellStart"/>
       <w:r>
@@ -45787,17 +45746,7 @@
           <w:szCs w:val="26"/>
           <w:lang w:val="vi-VN"/>
         </w:rPr>
-        <w:t xml:space="preserve">. Phân hệ bao gồm 4 tiến trình con xử lý các nghiệp vụ cốt </w:t>
-      </w:r>
-      <w:r>
-        <w:rPr>
-          <w:b w:val="0"/>
-          <w:bCs/>
-          <w:sz w:val="26"/>
-          <w:szCs w:val="26"/>
-          <w:lang w:val="vi-VN"/>
-        </w:rPr>
-        <w:t>lõi.</w:t>
+        <w:t>. Phân hệ bao gồm 4 tiến trình con xử lý các nghiệp vụ cốt lõi.</w:t>
       </w:r>
     </w:p>
     <w:p>
@@ -46339,17 +46288,7 @@
           <w:szCs w:val="26"/>
           <w:lang w:val="vi-VN"/>
         </w:rPr>
-        <w:t xml:space="preserve">- </w:t>
-      </w:r>
-      <w:r>
-        <w:rPr>
-          <w:b w:val="0"/>
-          <w:bCs/>
-          <w:sz w:val="26"/>
-          <w:szCs w:val="26"/>
-          <w:lang w:val="vi-VN"/>
-        </w:rPr>
-        <w:t>Tiếp nhận thông tin sản phẩm: Tiếp nhận thông tin sản phẩm do quản trị viên hoặc nhân viên cung cấp, chẳng hạn như tên sản phẩm, đơn giá, số lượng tồn kho, hình ảnh, mô tả hoặc thông tin nhóm sản phẩm.</w:t>
+        <w:t>- Tiếp nhận thông tin sản phẩm: Tiếp nhận thông tin sản phẩm do quản trị viên hoặc nhân viên cung cấp, chẳng hạn như tên sản phẩm, đơn giá, số lượng tồn kho, hình ảnh, mô tả hoặc thông tin nhóm sản phẩm.</w:t>
       </w:r>
     </w:p>
     <w:p>
@@ -46847,16 +46786,7 @@
           <w:szCs w:val="26"/>
           <w:lang w:val="vi-VN"/>
         </w:rPr>
-        <w:t xml:space="preserve"> </w:t>
-      </w:r>
-      <w:r>
-        <w:rPr>
-          <w:b w:val="0"/>
-          <w:sz w:val="26"/>
-          <w:szCs w:val="26"/>
-          <w:lang w:val="vi-VN"/>
-        </w:rPr>
-        <w:t>Phân hệ Quản lý đơn hàng đóng vai trò trung tâm trong quá trình vận hành thương mại điện tử, chịu trách nhiệm tiếp nhận, xử lý và kiểm soát toàn bộ vòng đời của đơn hàng từ khi khách hàng hoàn tất đặt mua cho đến khi giao hàng thành công. Phân hệ giúp đảm bảo sự đồng bộ giữa thông tin mua bán, luồng xử lý của nhân viên và trạng thái kho hàng thực tế.</w:t>
+        <w:t xml:space="preserve"> Phân hệ Quản lý đơn hàng đóng vai trò trung tâm trong quá trình vận hành thương mại điện tử, chịu trách nhiệm tiếp nhận, xử lý và kiểm soát toàn bộ vòng đời của đơn hàng từ khi khách hàng hoàn tất đặt mua cho đến khi giao hàng thành công. Phân hệ giúp đảm bảo sự đồng bộ giữa thông tin mua bán, luồng xử lý của nhân viên và trạng thái kho hàng thực tế.</w:t>
       </w:r>
     </w:p>
     <w:p>
@@ -47279,17 +47209,7 @@
           <w:szCs w:val="26"/>
           <w:lang w:val="vi-VN"/>
         </w:rPr>
-        <w:t xml:space="preserve">- </w:t>
-      </w:r>
-      <w:r>
-        <w:rPr>
-          <w:b w:val="0"/>
-          <w:bCs/>
-          <w:sz w:val="26"/>
-          <w:szCs w:val="26"/>
-          <w:lang w:val="vi-VN"/>
-        </w:rPr>
-        <w:t>Tiếp nhận thông tin thanh toán: Tiếp nhận thông tin và yêu cầu thanh toán từ khách hàng sau khi hoàn tất bước đặt hàng, bao gồm mã đơn hàng, tổng giá trị thanh toán, phương thức thanh toán được lựa chọn (COD, chuyển khoản ngân hàng, mã QR hoặc cổng thanh toán trực tuyến) và thông tin xác nhận giao dịch.</w:t>
+        <w:t>- Tiếp nhận thông tin thanh toán: Tiếp nhận thông tin và yêu cầu thanh toán từ khách hàng sau khi hoàn tất bước đặt hàng, bao gồm mã đơn hàng, tổng giá trị thanh toán, phương thức thanh toán được lựa chọn (COD, chuyển khoản ngân hàng, mã QR hoặc cổng thanh toán trực tuyến) và thông tin xác nhận giao dịch.</w:t>
       </w:r>
     </w:p>
     <w:p>
@@ -48003,6 +47923,7 @@
       </w:pPr>
       <w:r>
         <w:rPr>
+          <w:noProof/>
           <w:lang w:val="vi-VN"/>
         </w:rPr>
         <w:lastRenderedPageBreak/>
@@ -48246,6 +48167,7 @@
       </w:pPr>
       <w:r>
         <w:rPr>
+          <w:noProof/>
           <w:lang w:val="vi-VN"/>
         </w:rPr>
         <w:lastRenderedPageBreak/>
@@ -48531,6 +48453,7 @@
       </w:pPr>
       <w:r>
         <w:rPr>
+          <w:noProof/>
           <w:lang w:val="vi-VN"/>
         </w:rPr>
         <w:lastRenderedPageBreak/>
@@ -48891,6 +48814,7 @@
       </w:pPr>
       <w:r>
         <w:rPr>
+          <w:noProof/>
           <w:lang w:val="vi-VN"/>
         </w:rPr>
         <w:lastRenderedPageBreak/>
@@ -49022,6 +48946,7 @@
       </w:pPr>
       <w:r>
         <w:rPr>
+          <w:noProof/>
           <w:lang w:val="vi-VN"/>
         </w:rPr>
         <w:lastRenderedPageBreak/>
@@ -49180,6 +49105,7 @@
       </w:pPr>
       <w:r>
         <w:rPr>
+          <w:noProof/>
           <w:lang w:val="vi-VN"/>
         </w:rPr>
         <w:lastRenderedPageBreak/>
@@ -49311,6 +49237,7 @@
       </w:pPr>
       <w:r>
         <w:rPr>
+          <w:noProof/>
           <w:lang w:val="vi-VN"/>
         </w:rPr>
         <w:lastRenderedPageBreak/>
@@ -49440,6 +49367,7 @@
       </w:pPr>
       <w:r>
         <w:rPr>
+          <w:noProof/>
           <w:lang w:val="vi-VN"/>
         </w:rPr>
         <w:lastRenderedPageBreak/>
@@ -61563,6 +61491,7 @@
   <w:style w:type="character" w:default="1" w:styleId="Phngmcinhcuaoanvn">
     <w:name w:val="Default Paragraph Font"/>
     <w:uiPriority w:val="1"/>
+    <w:semiHidden/>
     <w:unhideWhenUsed/>
   </w:style>
   <w:style w:type="table" w:default="1" w:styleId="BangThngthng">

</xml_diff>